<commit_message>
Document ChatGPT Sites hosted demo
</commit_message>
<xml_diff>
--- a/GCON_2027_system_details_for_developers.docx
+++ b/GCON_2027_system_details_for_developers.docx
@@ -213,7 +213,7 @@
                 <w:color w:val="0B2545"/>
                 <w:sz w:val="19"/>
               </w:rPr>
-              <w:t>Working React/Vite + Node local MVP with encrypted local persistence</w:t>
+              <w:t>Working React/Vite + Node local MVP plus a private ChatGPT Sites hosted demo</w:t>
             </w:r>
           </w:p>
         </w:tc>
@@ -318,7 +318,7 @@
                 <w:color w:val="0B2545"/>
                 <w:sz w:val="21"/>
               </w:rPr>
-              <w:t>The platform is a role-based nursing intake and placement prototype. It supports a learner qualification check and application journey, staff review and placement operations, and an organisation-scoped employer view. The local implementation has a real API boundary, workflow state transitions, encrypted local persistence, document upload checks, audit events, and demo access. Production deployment still requires a managed database, private object storage, managed identity, malware scanning, external notification delivery, operational monitoring, and formal policy approval.</w:t>
+              <w:t>The platform is a role-based nursing intake and placement prototype. It supports a learner qualification check and application journey, staff review and placement operations, and an organisation-scoped employer view. The local implementation has a real API boundary, workflow state transitions, encrypted local persistence, document upload checks, audit events, and demo access. A private ChatGPT Sites deployment now provides a hosted presentation copy with the demo role pickers and seeded demo state. Production deployment still requires a managed database, private object storage, managed identity, malware scanning, external notification delivery, operational monitoring, and formal policy approval.</w:t>
             </w:r>
           </w:p>
         </w:tc>
@@ -1129,6 +1129,98 @@
         <w:spacing w:after="40"/>
       </w:pPr>
     </w:p>
+    <w:p>
+      <w:pPr>
+        <w:pStyle w:val="Heading2"/>
+        <w:keepNext/>
+      </w:pPr>
+      <w:r>
+        <w:rPr>
+          <w:rFonts w:ascii="Calibri" w:hAnsi="Calibri"/>
+          <w:b/>
+          <w:color w:val="2E74B5"/>
+          <w:sz w:val="26"/>
+        </w:rPr>
+        <w:t>ChatGPT Sites hosted demo</w:t>
+      </w:r>
+    </w:p>
+    <w:p>
+      <w:pPr>
+        <w:spacing w:before="0" w:after="120" w:line="300" w:lineRule="auto"/>
+      </w:pPr>
+      <w:r>
+        <w:rPr>
+          <w:rFonts w:ascii="Calibri" w:hAnsi="Calibri"/>
+          <w:sz w:val="22"/>
+        </w:rPr>
+        <w:t>The current frontend demo is published privately at https://gcon-nursing-intake.alistairljohanson.chatgpt.site. The Sites deployment uses the compiled Vite assets plus dist/server/index.js, a Cloudflare-compatible worker generated by tools/build-sites-worker.mjs. The hosted worker serves the learner, admissions and employer presentation surfaces and provides a deliberately limited demo API with seeded state so the retained role pickers continue to work outside the local machine.</w:t>
+      </w:r>
+    </w:p>
+    <w:tbl>
+      <w:tblPr>
+        <w:tblW w:type="dxa" w:w="9360"/>
+        <w:jc w:val="left"/>
+        <w:tblLayout w:type="fixed"/>
+        <w:tblLook w:firstColumn="1" w:firstRow="1" w:lastColumn="0" w:lastRow="0" w:noHBand="0" w:noVBand="1" w:val="04A0"/>
+        <w:tblInd w:w="120" w:type="dxa"/>
+      </w:tblPr>
+      <w:tblGrid>
+        <w:gridCol w:w="9360"/>
+      </w:tblGrid>
+      <w:tr>
+        <w:trPr>
+          <w:tblHeader/>
+        </w:trPr>
+        <w:tc>
+          <w:tcPr>
+            <w:tcW w:type="dxa" w:w="9360"/>
+            <w:vAlign w:val="center"/>
+            <w:tcMar>
+              <w:top w:w="80" w:type="dxa"/>
+              <w:start w:w="120" w:type="dxa"/>
+              <w:bottom w:w="80" w:type="dxa"/>
+              <w:end w:w="120" w:type="dxa"/>
+            </w:tcMar>
+            <w:tcBorders>
+              <w:top w:val="single" w:sz="6" w:space="0" w:color="D7DEE6"/>
+              <w:left w:val="single" w:sz="6" w:space="0" w:color="D7DEE6"/>
+              <w:bottom w:val="single" w:sz="6" w:space="0" w:color="D7DEE6"/>
+              <w:right w:val="single" w:sz="6" w:space="0" w:color="D7DEE6"/>
+              <w:insideH w:val="single" w:sz="6" w:space="0" w:color="D7DEE6"/>
+              <w:insideV w:val="single" w:sz="6" w:space="0" w:color="D7DEE6"/>
+            </w:tcBorders>
+            <w:shd w:fill="FFF8E8"/>
+          </w:tcPr>
+          <w:p>
+            <w:pPr>
+              <w:spacing w:before="0" w:after="40" w:line="288" w:lineRule="auto"/>
+            </w:pPr>
+            <w:r>
+              <w:rPr>
+                <w:rFonts w:ascii="Calibri" w:hAnsi="Calibri"/>
+                <w:b/>
+                <w:color w:val="7A5A00"/>
+                <w:sz w:val="21"/>
+              </w:rPr>
+              <w:t xml:space="preserve">Hosted demo boundary: </w:t>
+            </w:r>
+            <w:r>
+              <w:rPr>
+                <w:rFonts w:ascii="Calibri" w:hAnsi="Calibri"/>
+                <w:color w:val="0B2545"/>
+                <w:sz w:val="21"/>
+              </w:rPr>
+              <w:t>The Sites demo is not connected to the local encrypted API, PostgreSQL, Azure Blob Storage or local uploaded documents. Hosted state-changing actions are not a production persistence boundary. Use the local app for API, real-file upload, audit, database and document-storage acceptance. The Sites project is private to the owning ChatGPT account until its access policy is deliberately changed.</w:t>
+            </w:r>
+          </w:p>
+        </w:tc>
+      </w:tr>
+    </w:tbl>
+    <w:p>
+      <w:pPr>
+        <w:spacing w:after="40"/>
+      </w:pPr>
+    </w:p>
     <w:tbl>
       <w:tblPr>
         <w:tblW w:type="dxa" w:w="9360"/>
@@ -1584,6 +1676,62 @@
                 <w:sz w:val="18"/>
               </w:rPr>
               <w:t>Application Insights/Log Analytics, alerts, backups, restore rehearsals, incident response and privacy-safe telemetry.</w:t>
+            </w:r>
+          </w:p>
+        </w:tc>
+      </w:tr>
+      <w:tr>
+        <w:tc>
+          <w:tcPr>
+            <w:tcW w:type="dxa" w:w="1800"/>
+          </w:tcPr>
+          <w:p>
+            <w:pPr>
+              <w:spacing w:before="0" w:after="0" w:line="269" w:lineRule="auto"/>
+            </w:pPr>
+            <w:r>
+              <w:rPr>
+                <w:rFonts w:ascii="Calibri" w:hAnsi="Calibri"/>
+                <w:color w:val="0B2545"/>
+                <w:sz w:val="18"/>
+              </w:rPr>
+              <w:t>Hosted demo</w:t>
+            </w:r>
+          </w:p>
+        </w:tc>
+        <w:tc>
+          <w:tcPr>
+            <w:tcW w:type="dxa" w:w="3600"/>
+          </w:tcPr>
+          <w:p>
+            <w:pPr>
+              <w:spacing w:before="0" w:after="0" w:line="269" w:lineRule="auto"/>
+            </w:pPr>
+            <w:r>
+              <w:rPr>
+                <w:rFonts w:ascii="Calibri" w:hAnsi="Calibri"/>
+                <w:color w:val="0B2545"/>
+                <w:sz w:val="18"/>
+              </w:rPr>
+              <w:t>Private ChatGPT Sites deployment at gcon-nursing-intake.alistairljohanson.chatgpt.site. npm run build generates the static/demo worker and .openai/hosting.json stores only the Sites project ID.</w:t>
+            </w:r>
+          </w:p>
+        </w:tc>
+        <w:tc>
+          <w:tcPr>
+            <w:tcW w:type="dxa" w:w="3960"/>
+          </w:tcPr>
+          <w:p>
+            <w:pPr>
+              <w:spacing w:before="0" w:after="0" w:line="269" w:lineRule="auto"/>
+            </w:pPr>
+            <w:r>
+              <w:rPr>
+                <w:rFonts w:ascii="Calibri" w:hAnsi="Calibri"/>
+                <w:color w:val="0B2545"/>
+                <w:sz w:val="18"/>
+              </w:rPr>
+              <w:t>Deploy the approved production frontend against the production API, managed identity, database, private document storage and external notification services.</w:t>
             </w:r>
           </w:p>
         </w:tc>
@@ -4391,7 +4539,7 @@
                 <w:color w:val="0B2545"/>
                 <w:sz w:val="18"/>
               </w:rPr>
-              <w:t>28 Node tests currently pass across domain, auth, qualification and upload-policy suites. Extend with document magic-byte fixtures, cross-organisation denial and notification status failure/retry cases.</w:t>
+              <w:t>30 Node tests currently pass across domain, auth, qualification and upload-policy suites. Extend with document magic-byte fixtures, cross-organisation denial and notification status failure/retry cases.</w:t>
             </w:r>
           </w:p>
         </w:tc>
@@ -4429,7 +4577,7 @@
                 <w:color w:val="0B2545"/>
                 <w:sz w:val="18"/>
               </w:rPr>
-              <w:t>npm run build passes after the active frontend was moved off mockStore.js. Re-run after any demo UI change.</w:t>
+              <w:t>npm run build passes, compiles the Vite frontend and generates the Sites worker at dist/server/index.js. Re-run after any demo UI change.</w:t>
             </w:r>
           </w:p>
         </w:tc>
@@ -4468,6 +4616,44 @@
                 <w:sz w:val="18"/>
               </w:rPr>
               <w:t>Use the running local frontend at http://127.0.0.1:4173/ and API health at http://127.0.0.1:4000/v1/health. Re-run learner upload, staff document actions, employer placement response and session expiry flows before the presentation.</w:t>
+            </w:r>
+          </w:p>
+        </w:tc>
+      </w:tr>
+      <w:tr>
+        <w:tc>
+          <w:tcPr>
+            <w:tcW w:type="dxa" w:w="2200"/>
+          </w:tcPr>
+          <w:p>
+            <w:pPr>
+              <w:spacing w:before="0" w:after="0" w:line="269" w:lineRule="auto"/>
+            </w:pPr>
+            <w:r>
+              <w:rPr>
+                <w:rFonts w:ascii="Calibri" w:hAnsi="Calibri"/>
+                <w:color w:val="0B2545"/>
+                <w:sz w:val="18"/>
+              </w:rPr>
+              <w:t>Hosted demo QA</w:t>
+            </w:r>
+          </w:p>
+        </w:tc>
+        <w:tc>
+          <w:tcPr>
+            <w:tcW w:type="dxa" w:w="7160"/>
+          </w:tcPr>
+          <w:p>
+            <w:pPr>
+              <w:spacing w:before="0" w:after="0" w:line="269" w:lineRule="auto"/>
+            </w:pPr>
+            <w:r>
+              <w:rPr>
+                <w:rFonts w:ascii="Calibri" w:hAnsi="Calibri"/>
+                <w:color w:val="0B2545"/>
+                <w:sz w:val="18"/>
+              </w:rPr>
+              <w:t>Open https://gcon-nursing-intake.alistairljohanson.chatgpt.site, choose Applicant, Admissions or Employer demo, and confirm the corresponding view loads. Hosted data is presentation-only and must not be used to validate persistence.</w:t>
             </w:r>
           </w:p>
         </w:tc>
@@ -4884,6 +5070,44 @@
           </w:p>
         </w:tc>
       </w:tr>
+      <w:tr>
+        <w:tc>
+          <w:tcPr>
+            <w:tcW w:type="dxa" w:w="2200"/>
+          </w:tcPr>
+          <w:p>
+            <w:pPr>
+              <w:spacing w:before="0" w:after="0" w:line="269" w:lineRule="auto"/>
+            </w:pPr>
+            <w:r>
+              <w:rPr>
+                <w:rFonts w:ascii="Calibri" w:hAnsi="Calibri"/>
+                <w:color w:val="0B2545"/>
+                <w:sz w:val="18"/>
+              </w:rPr>
+              <w:t>ChatGPT Sites</w:t>
+            </w:r>
+          </w:p>
+        </w:tc>
+        <w:tc>
+          <w:tcPr>
+            <w:tcW w:type="dxa" w:w="7160"/>
+          </w:tcPr>
+          <w:p>
+            <w:pPr>
+              <w:spacing w:before="0" w:after="0" w:line="269" w:lineRule="auto"/>
+            </w:pPr>
+            <w:r>
+              <w:rPr>
+                <w:rFonts w:ascii="Calibri" w:hAnsi="Calibri"/>
+                <w:color w:val="0B2545"/>
+                <w:sz w:val="18"/>
+              </w:rPr>
+              <w:t>Private hosted demo URL: https://gcon-nursing-intake.alistairljohanson.chatgpt.site. Sign in with the owning ChatGPT account, then use the retained demo role pickers.</w:t>
+            </w:r>
+          </w:p>
+        </w:tc>
+      </w:tr>
     </w:tbl>
     <w:p>
       <w:pPr>
@@ -4899,7 +5123,7 @@
           <w:rFonts w:ascii="Calibri" w:hAnsi="Calibri"/>
           <w:sz w:val="22"/>
         </w:rPr>
-        <w:t>The demo shortcuts intentionally remain in the local login dialog for tomorrow's presentation. They use the demo endpoint and must be disabled by setting GCON_AUTH_MODE to a non-demo production mode and configuring the external identity adapter.</w:t>
+        <w:t>The demo shortcuts intentionally remain in the local login dialog and in the private hosted presentation copy. Local shortcuts use the local demo endpoint; the hosted copy uses its limited seeded demo worker. Both are presentation-only and must be disabled by setting GCON_AUTH_MODE to a non-demo production mode and configuring the external identity adapter for production.</w:t>
       </w:r>
     </w:p>
     <w:p>
@@ -5018,7 +5242,7 @@
           <w:rFonts w:ascii="Calibri" w:hAnsi="Calibri"/>
           <w:sz w:val="22"/>
         </w:rPr>
-        <w:t>After API/database acceptance, remove demo-only data paths and prototype-only components from the production build. Keep the demo shortcuts only in the isolated presentation/local configuration until the demo is complete.</w:t>
+        <w:t>After API/database acceptance, remove demo-only data paths and prototype-only components from the production build. Keep the demo shortcuts only in the isolated presentation/local configuration until the demo is complete; do not treat the hosted Sites worker as the production API.</w:t>
       </w:r>
     </w:p>
     <w:p>
@@ -5632,6 +5856,82 @@
                 <w:color w:val="0B2545"/>
                 <w:sz w:val="18"/>
               </w:rPr>
+              <w:t>tools/build-sites-worker.mjs</w:t>
+            </w:r>
+          </w:p>
+        </w:tc>
+        <w:tc>
+          <w:tcPr>
+            <w:tcW w:type="dxa" w:w="6260"/>
+          </w:tcPr>
+          <w:p>
+            <w:pPr>
+              <w:spacing w:before="0" w:after="0" w:line="269" w:lineRule="auto"/>
+            </w:pPr>
+            <w:r>
+              <w:rPr>
+                <w:rFonts w:ascii="Calibri" w:hAnsi="Calibri"/>
+                <w:color w:val="0B2545"/>
+                <w:sz w:val="18"/>
+              </w:rPr>
+              <w:t>Generate the Cloudflare-compatible static/demo worker used by the private ChatGPT Sites presentation deployment.</w:t>
+            </w:r>
+          </w:p>
+        </w:tc>
+      </w:tr>
+      <w:tr>
+        <w:tc>
+          <w:tcPr>
+            <w:tcW w:type="dxa" w:w="3100"/>
+          </w:tcPr>
+          <w:p>
+            <w:pPr>
+              <w:spacing w:before="0" w:after="0" w:line="269" w:lineRule="auto"/>
+            </w:pPr>
+            <w:r>
+              <w:rPr>
+                <w:rFonts w:ascii="Calibri" w:hAnsi="Calibri"/>
+                <w:color w:val="0B2545"/>
+                <w:sz w:val="18"/>
+              </w:rPr>
+              <w:t>.openai/hosting.json</w:t>
+            </w:r>
+          </w:p>
+        </w:tc>
+        <w:tc>
+          <w:tcPr>
+            <w:tcW w:type="dxa" w:w="6260"/>
+          </w:tcPr>
+          <w:p>
+            <w:pPr>
+              <w:spacing w:before="0" w:after="0" w:line="269" w:lineRule="auto"/>
+            </w:pPr>
+            <w:r>
+              <w:rPr>
+                <w:rFonts w:ascii="Calibri" w:hAnsi="Calibri"/>
+                <w:color w:val="0B2545"/>
+                <w:sz w:val="18"/>
+              </w:rPr>
+              <w:t>Sites project binding. Contains only the opaque project ID; credentials are not stored in the repository.</w:t>
+            </w:r>
+          </w:p>
+        </w:tc>
+      </w:tr>
+      <w:tr>
+        <w:tc>
+          <w:tcPr>
+            <w:tcW w:type="dxa" w:w="3100"/>
+          </w:tcPr>
+          <w:p>
+            <w:pPr>
+              <w:spacing w:before="0" w:after="0" w:line="269" w:lineRule="auto"/>
+            </w:pPr>
+            <w:r>
+              <w:rPr>
+                <w:rFonts w:ascii="Calibri" w:hAnsi="Calibri"/>
+                <w:color w:val="0B2545"/>
+                <w:sz w:val="18"/>
+              </w:rPr>
               <w:t>npm run dev:api</w:t>
             </w:r>
           </w:p>
@@ -5790,6 +6090,28 @@
           <w:sz w:val="20"/>
         </w:rPr>
         <w:t>C:\GCRA\nurse</w:t>
+      </w:r>
+    </w:p>
+    <w:p>
+      <w:pPr>
+        <w:spacing w:before="0" w:after="60" w:line="276" w:lineRule="auto"/>
+      </w:pPr>
+      <w:r>
+        <w:rPr>
+          <w:rFonts w:ascii="Calibri" w:hAnsi="Calibri"/>
+          <w:b/>
+          <w:color w:val="5F6B76"/>
+          <w:sz w:val="20"/>
+        </w:rPr>
+        <w:t xml:space="preserve">Hosted demo: </w:t>
+      </w:r>
+      <w:r>
+        <w:rPr>
+          <w:rFonts w:ascii="Calibri" w:hAnsi="Calibri"/>
+          <w:color w:val="0B2545"/>
+          <w:sz w:val="20"/>
+        </w:rPr>
+        <w:t>https://gcon-nursing-intake.alistairljohanson.chatgpt.site (private ChatGPT Sites deployment)</w:t>
       </w:r>
     </w:p>
     <w:sectPr>

</xml_diff>

<commit_message>
Implement nursing intake feedback changes
</commit_message>
<xml_diff>
--- a/GCON_2027_system_details_for_developers.docx
+++ b/GCON_2027_system_details_for_developers.docx
@@ -173,7 +173,7 @@
                 <w:color w:val="0B2545"/>
                 <w:sz w:val="19"/>
               </w:rPr>
-              <w:t>4 August 2026</w:t>
+              <w:t>15 August 2026</w:t>
             </w:r>
           </w:p>
         </w:tc>
@@ -318,7 +318,7 @@
                 <w:color w:val="0B2545"/>
                 <w:sz w:val="21"/>
               </w:rPr>
-              <w:t>The platform is a role-based nursing intake and placement prototype. It supports a learner qualification check and application journey, staff review and placement operations, and an organisation-scoped employer view. The local implementation has a real API boundary, workflow state transitions, encrypted local persistence, document upload checks, audit events, and demo access. A private ChatGPT Sites deployment now provides a hosted presentation copy with the demo role pickers and seeded demo state. Production deployment still requires a managed database, private object storage, managed identity, malware scanning, external notification delivery, operational monitoring, and formal policy approval.</w:t>
+              <w:t>The platform is a role-based nursing intake and placement prototype. It supports a learner qualification check and application journey, staff review and placement operations, and an organisation-scoped employer view. The local implementation has a real API boundary, workflow state transitions, encrypted local persistence, document upload checks, audit events, pathway-scoped academic ranking, and demo access. A private ChatGPT Sites deployment now provides a hosted presentation copy with the demo role pickers and seeded demo state. Production deployment still requires a managed database, private object storage, managed identity, malware scanning, external notification delivery, operational monitoring, and formal policy approval. No cross-pathway academic equivalency matrix is currently approved.</w:t>
             </w:r>
           </w:p>
         </w:tc>
@@ -512,7 +512,7 @@
                 <w:color w:val="0B2545"/>
                 <w:sz w:val="18"/>
               </w:rPr>
-              <w:t>Landing page, configurable intake banner, qualification checker, three pathway forms, profile, preferences, address confirmation, evidence upload, review, receipt, correction request and final outcome views.</w:t>
+              <w:t>Landing page with the current advert and top navigation, server-rechecked qualification checker, pathway forms, ID-number access management, profile, remaining subjects, preferences, address confirmation, evidence upload, training and work history, review, receipt, correction request and final outcome views.</w:t>
             </w:r>
           </w:p>
         </w:tc>
@@ -568,7 +568,7 @@
                 <w:color w:val="0B2545"/>
                 <w:sz w:val="18"/>
               </w:rPr>
-              <w:t>Dashboard, submitted applications, review queue, per-document verify/reject/request-correction actions, controlled application decisions, shortlist, psychometric invitation and outcome, communications, placements, withdrawals, termination-letter recording, reports and audit.</w:t>
+              <w:t>Dashboard, submitted applications, academic ranks within each pathway, review queue, per-document verify/reject/request-correction actions, individual and mass decline decisions, linked in-app outcomes, shortlist, psychometric invitation and outcome, communications, capacity-controlled placements, withdrawals, termination-letter recording, reports and audit.</w:t>
             </w:r>
           </w:p>
         </w:tc>
@@ -586,7 +586,7 @@
                 <w:color w:val="0B2545"/>
                 <w:sz w:val="18"/>
               </w:rPr>
-              <w:t>The API is a Node local service rather than the planned NestJS/PostgreSQL production stack. Some seeded demo records have already been used during QA.</w:t>
+              <w:t>The API is a Node local service rather than the planned NestJS/PostgreSQL production stack. Cross-pathway ranking remains unavailable without an approved equivalency matrix. Some seeded demo records have already been used during QA.</w:t>
             </w:r>
           </w:p>
         </w:tc>
@@ -624,7 +624,7 @@
                 <w:color w:val="0B2545"/>
                 <w:sz w:val="18"/>
               </w:rPr>
-              <w:t>Organisation-scoped dashboard, released candidates, placement offer responses and placement state visibility.</w:t>
+              <w:t>Organisation-scoped dashboard, released candidates, placement offer responses, placement state visibility, approved campus directory, print/PDF view and campus-grouped Excel export.</w:t>
             </w:r>
           </w:p>
         </w:tc>
@@ -680,7 +680,7 @@
                 <w:color w:val="0B2545"/>
                 <w:sz w:val="18"/>
               </w:rPr>
-              <w:t>Real email/password local sessions, expiry handling, invitations, membership-derived roles, logout, plus retained local demo shortcuts for the presentation.</w:t>
+              <w:t>Real email/password local sessions, learner account creation with an ID-number username, expiry handling, invitations, membership-derived roles, logout, plus retained local demo shortcuts for the presentation.</w:t>
             </w:r>
           </w:p>
         </w:tc>
@@ -874,7 +874,7 @@
           <w:rFonts w:ascii="Calibri" w:hAnsi="Calibri"/>
           <w:sz w:val="22"/>
         </w:rPr>
-        <w:t>Run the qualification checker before full registration. Supported pathways are Senior Certificate / Standard 10, National Senior Certificate / Grade 12, and NC(V) Level 4.</w:t>
+        <w:t>Run the qualification checker before full registration. Supported pathways are Senior Certificate / Standard 10, National Senior Certificate / Grade 12, and NC(V) Level 4. Original pathway values are preserved and are not converted into a common score.</w:t>
       </w:r>
     </w:p>
     <w:p>
@@ -887,7 +887,7 @@
           <w:rFonts w:ascii="Calibri" w:hAnsi="Calibri"/>
           <w:sz w:val="22"/>
         </w:rPr>
-        <w:t>If the learner qualifies, continue to the pathway-specific profile and application form. If not, only the minimum contact request is retained; qualification evidence is not kept by the non-qualifier contact function.</w:t>
+        <w:t>If the learner qualifies, create an ID-number account through Access management, then continue to the pathway-specific profile and application form. If not, show the selected certificate and masked ID for reference while retaining only the minimum contact request.</w:t>
       </w:r>
     </w:p>
     <w:p>
@@ -900,7 +900,7 @@
           <w:rFonts w:ascii="Calibri" w:hAnsi="Calibri"/>
           <w:sz w:val="22"/>
         </w:rPr>
-        <w:t>Capture personal details, South African ID, structured Gauteng address, school, result year, preferences, previous nursing training, work experience, references and the two approved evidence documents.</w:t>
+        <w:t>Capture personal details, South African ID, structured Gauteng address, school, result year, pathway-specific remaining subjects, preferences, previous nursing training, detailed work experience, references and the two approved evidence documents.</w:t>
       </w:r>
     </w:p>
     <w:p>
@@ -913,7 +913,7 @@
           <w:rFonts w:ascii="Calibri" w:hAnsi="Calibri"/>
           <w:sz w:val="22"/>
         </w:rPr>
-        <w:t>Upload real PDF, JPG or PNG files through an API upload intent, direct content upload and completion/checksum step. The learner sees a saved draft and can return later.</w:t>
+        <w:t>Upload real PDF, JPG or PNG files through an API upload intent, direct content upload and completion/checksum step. The returned document state is retained in the draft and the learner can retry failures.</w:t>
       </w:r>
     </w:p>
     <w:p>
@@ -980,6 +980,19 @@
           <w:rFonts w:ascii="Calibri" w:hAnsi="Calibri"/>
           <w:sz w:val="22"/>
         </w:rPr>
+        <w:t>Use academic rank only within the applicant's qualification pathway. APS, M score and NC(V) percentages are different measures and are not placed into a common intake-wide order.</w:t>
+      </w:r>
+    </w:p>
+    <w:p>
+      <w:pPr>
+        <w:pStyle w:val="ListNumber"/>
+        <w:spacing w:before="0" w:after="80" w:line="300" w:lineRule="auto"/>
+      </w:pPr>
+      <w:r>
+        <w:rPr>
+          <w:rFonts w:ascii="Calibri" w:hAnsi="Calibri"/>
+          <w:sz w:val="22"/>
+        </w:rPr>
         <w:t>Review original pathway values and each evidence document. Each document can be verified, rejected, or marked correction required with a reason.</w:t>
       </w:r>
     </w:p>
@@ -993,7 +1006,7 @@
           <w:rFonts w:ascii="Calibri" w:hAnsi="Calibri"/>
           <w:sz w:val="22"/>
         </w:rPr>
-        <w:t>Record the controlled application decision: approve for shortlist, request correction, decline with a controlled reason, or undo where allowed by the current workflow.</w:t>
+        <w:t>Record the controlled application decision: approve for shortlist, request correction, decline with a controlled reason, use mass decline for eligible under-review/correction-requested records, or undo where allowed by the current workflow.</w:t>
       </w:r>
     </w:p>
     <w:p>
@@ -2258,6 +2271,71 @@
         <w:tblInd w:w="120" w:type="dxa"/>
       </w:tblPr>
       <w:tblGrid>
+        <w:gridCol w:w="9360"/>
+      </w:tblGrid>
+      <w:tr>
+        <w:trPr>
+          <w:tblHeader/>
+        </w:trPr>
+        <w:tc>
+          <w:tcPr>
+            <w:tcW w:type="dxa" w:w="9360"/>
+            <w:vAlign w:val="center"/>
+            <w:tcMar>
+              <w:top w:w="80" w:type="dxa"/>
+              <w:start w:w="120" w:type="dxa"/>
+              <w:bottom w:w="80" w:type="dxa"/>
+              <w:end w:w="120" w:type="dxa"/>
+            </w:tcMar>
+            <w:tcBorders>
+              <w:top w:val="single" w:sz="6" w:space="0" w:color="D7DEE6"/>
+              <w:left w:val="single" w:sz="6" w:space="0" w:color="D7DEE6"/>
+              <w:bottom w:val="single" w:sz="6" w:space="0" w:color="D7DEE6"/>
+              <w:right w:val="single" w:sz="6" w:space="0" w:color="D7DEE6"/>
+              <w:insideH w:val="single" w:sz="6" w:space="0" w:color="D7DEE6"/>
+              <w:insideV w:val="single" w:sz="6" w:space="0" w:color="D7DEE6"/>
+            </w:tcBorders>
+            <w:shd w:fill="FFF8E8"/>
+          </w:tcPr>
+          <w:p>
+            <w:pPr>
+              <w:spacing w:before="0" w:after="40" w:line="288" w:lineRule="auto"/>
+            </w:pPr>
+            <w:r>
+              <w:rPr>
+                <w:rFonts w:ascii="Calibri" w:hAnsi="Calibri"/>
+                <w:b/>
+                <w:color w:val="7A5A00"/>
+                <w:sz w:val="21"/>
+              </w:rPr>
+              <w:t xml:space="preserve">Academic ranking boundary: </w:t>
+            </w:r>
+            <w:r>
+              <w:rPr>
+                <w:rFonts w:ascii="Calibri" w:hAnsi="Calibri"/>
+                <w:color w:val="0B2545"/>
+                <w:sz w:val="21"/>
+              </w:rPr>
+              <w:t>Academic rank is calculated separately within the NSC / Grade 12, Senior Certificate and NC(V) Level 4 pathways. An APS, M score and NC(V) percentage are not numerically comparable, so the MVP does not produce one cross-pathway order. Cross-pathway ranking must remain unavailable until GCON approves a versioned equivalency matrix covering formulas, included subjects, weights, maxima, rounding, ties, upgraded or missing results, validation evidence, effective cycle, approvers and appeals.</w:t>
+            </w:r>
+          </w:p>
+        </w:tc>
+      </w:tr>
+    </w:tbl>
+    <w:p>
+      <w:pPr>
+        <w:spacing w:after="40"/>
+      </w:pPr>
+    </w:p>
+    <w:tbl>
+      <w:tblPr>
+        <w:tblW w:type="dxa" w:w="9360"/>
+        <w:jc w:val="left"/>
+        <w:tblLayout w:type="fixed"/>
+        <w:tblLook w:firstColumn="1" w:firstRow="1" w:lastColumn="0" w:lastRow="0" w:noHBand="0" w:noVBand="1" w:val="04A0"/>
+        <w:tblInd w:w="120" w:type="dxa"/>
+      </w:tblPr>
+      <w:tblGrid>
         <w:gridCol w:w="2200"/>
         <w:gridCol w:w="7160"/>
       </w:tblGrid>
@@ -2446,6 +2524,44 @@
                 <w:sz w:val="18"/>
               </w:rPr>
               <w:t>Fundamental subjects at 50% or higher; SA Health Care System, Public Health, The Human Body and Mind, and Community Oriented Primary Care at 60% or higher.</w:t>
+            </w:r>
+          </w:p>
+        </w:tc>
+      </w:tr>
+      <w:tr>
+        <w:tc>
+          <w:tcPr>
+            <w:tcW w:type="dxa" w:w="2200"/>
+          </w:tcPr>
+          <w:p>
+            <w:pPr>
+              <w:spacing w:before="0" w:after="0" w:line="269" w:lineRule="auto"/>
+            </w:pPr>
+            <w:r>
+              <w:rPr>
+                <w:rFonts w:ascii="Calibri" w:hAnsi="Calibri"/>
+                <w:color w:val="0B2545"/>
+                <w:sz w:val="18"/>
+              </w:rPr>
+              <w:t>Academic ranking</w:t>
+            </w:r>
+          </w:p>
+        </w:tc>
+        <w:tc>
+          <w:tcPr>
+            <w:tcW w:type="dxa" w:w="7160"/>
+          </w:tcPr>
+          <w:p>
+            <w:pPr>
+              <w:spacing w:before="0" w:after="0" w:line="269" w:lineRule="auto"/>
+            </w:pPr>
+            <w:r>
+              <w:rPr>
+                <w:rFonts w:ascii="Calibri" w:hAnsi="Calibri"/>
+                <w:color w:val="0B2545"/>
+                <w:sz w:val="18"/>
+              </w:rPr>
+              <w:t>Eligible records are ordered only against records in the same qualification pathway, using the pathway's original reported academic value. No common score or cross-pathway rank is approved.</w:t>
             </w:r>
           </w:p>
         </w:tc>
@@ -2743,7 +2859,7 @@
                 <w:color w:val="0B2545"/>
                 <w:sz w:val="18"/>
               </w:rPr>
-              <w:t>Cycle ID, name/season, open date, close date, advert status, reference date, policy status and document labels.</w:t>
+              <w:t>Cycle ID, name/season, open date, close date, advert status, reference date, policy status, document labels and any future approved equivalency-matrix version.</w:t>
             </w:r>
           </w:p>
         </w:tc>
@@ -2781,7 +2897,7 @@
                 <w:color w:val="0B2545"/>
                 <w:sz w:val="18"/>
               </w:rPr>
-              <w:t>Reference, owner, pathway, profile, preferences, original pathway values, status, submittedAt, correction request, outcome and placement information.</w:t>
+              <w:t>Reference, owner, pathway, profile, remaining subjects, preferences, original pathway values, training history, work experience, status, submittedAt, correction request, outcome and placement information.</w:t>
             </w:r>
           </w:p>
         </w:tc>
@@ -3205,7 +3321,7 @@
                 <w:color w:val="0B2545"/>
                 <w:sz w:val="18"/>
               </w:rPr>
-              <w:t>GET /v1/health; GET /v1/openapi.json; GET /v1/storage/status</w:t>
+              <w:t>GET /v1/health; GET /v1/openapi.json; GET /v1/storage/status; GET /v1/state</w:t>
             </w:r>
           </w:p>
         </w:tc>
@@ -3243,7 +3359,45 @@
                 <w:color w:val="0B2545"/>
                 <w:sz w:val="18"/>
               </w:rPr>
-              <w:t>POST /v1/auth/login; POST /v1/auth/logout; GET /v1/auth/session; POST /v1/auth/invitations; GET /v1/auth/invitations; POST /v1/auth/invitations/accept; POST /v1/auth/demo-login</w:t>
+              <w:t>POST /v1/auth/login; POST /v1/auth/logout; GET /v1/auth/session; POST /v1/auth/invitations; GET /v1/auth/invitations; POST /v1/auth/invitations/accept; POST /v1/auth/demo-login; POST /v1/auth/learner/register</w:t>
+            </w:r>
+          </w:p>
+        </w:tc>
+      </w:tr>
+      <w:tr>
+        <w:tc>
+          <w:tcPr>
+            <w:tcW w:type="dxa" w:w="2200"/>
+          </w:tcPr>
+          <w:p>
+            <w:pPr>
+              <w:spacing w:before="0" w:after="0" w:line="269" w:lineRule="auto"/>
+            </w:pPr>
+            <w:r>
+              <w:rPr>
+                <w:rFonts w:ascii="Calibri" w:hAnsi="Calibri"/>
+                <w:color w:val="0B2545"/>
+                <w:sz w:val="18"/>
+              </w:rPr>
+              <w:t>Qualification</w:t>
+            </w:r>
+          </w:p>
+        </w:tc>
+        <w:tc>
+          <w:tcPr>
+            <w:tcW w:type="dxa" w:w="7160"/>
+          </w:tcPr>
+          <w:p>
+            <w:pPr>
+              <w:spacing w:before="0" w:after="0" w:line="269" w:lineRule="auto"/>
+            </w:pPr>
+            <w:r>
+              <w:rPr>
+                <w:rFonts w:ascii="Calibri" w:hAnsi="Calibri"/>
+                <w:color w:val="0B2545"/>
+                <w:sz w:val="18"/>
+              </w:rPr>
+              <w:t>POST /v1/qualification/evaluate; returns the selected pathway's original score/result without a cross-pathway conversion.</w:t>
             </w:r>
           </w:p>
         </w:tc>
@@ -3319,7 +3473,7 @@
                 <w:color w:val="0B2545"/>
                 <w:sz w:val="18"/>
               </w:rPr>
-              <w:t>GET/PATCH /v1/applications/me; POST /v1/applications/submit; POST /v1/applications/non-qualifier</w:t>
+              <w:t>GET/PATCH /v1/applications/me; POST /v1/applications/submit; POST /v1/applications/non-qualifier; GET/POST /v1/applicant/chat</w:t>
             </w:r>
           </w:p>
         </w:tc>
@@ -3395,7 +3549,7 @@
                 <w:color w:val="0B2545"/>
                 <w:sz w:val="18"/>
               </w:rPr>
-              <w:t>GET /v1/reviews/queue; POST /v1/reviews/{ref}/decision; POST /v1/shortlists</w:t>
+              <w:t>GET /v1/reviews/queue; POST /v1/reviews/{ref}/decision; POST /v1/reviews/mass-decline; POST /v1/shortlists</w:t>
             </w:r>
           </w:p>
         </w:tc>
@@ -3689,7 +3843,7 @@
           <w:rFonts w:ascii="Calibri" w:hAnsi="Calibri"/>
           <w:sz w:val="22"/>
         </w:rPr>
-        <w:t>Eligibility wording: pathway names, approved subject labels, thresholds, APS/M score rules and NC(V) percentage rules, with an approval state and effective version.</w:t>
+        <w:t>Eligibility wording: pathway names, approved subject labels, thresholds, APS/M score rules and NC(V) percentage rules, with an approval state and effective version. Any cross-pathway equivalency matrix must be a separate approved, versioned policy object rather than an inferred conversion.</w:t>
       </w:r>
     </w:p>
     <w:p>
@@ -3768,7 +3922,7 @@
           <w:rFonts w:ascii="Calibri" w:hAnsi="Calibri"/>
           <w:sz w:val="22"/>
         </w:rPr>
-        <w:t>The local API already supports the active cycle name, open date, close date and Published/Paused advert status through PATCH /v1/intake/current. The current checker rules and document labels are still code-defined and provisional. For production, introduce versioned IntakeCycle and IntakeRequirement records, an administrator-only configuration screen, approval/sign-off before publishing, and immutable linkage from every application to the configuration version used at submission.</w:t>
+        <w:t>The local API already supports the active cycle name, open date, close date and Published/Paused advert status through PATCH /v1/intake/current. The current checker rules, document labels and within-pathway ranking behavior are still code-defined and provisional. No cross-pathway equivalency is configured. For production, introduce versioned IntakeCycle and IntakeRequirement records, an administrator-only configuration screen, approval/sign-off before publishing, and immutable linkage from every application to the configuration version used at submission.</w:t>
       </w:r>
     </w:p>
     <w:tbl>
@@ -4058,6 +4212,62 @@
                 <w:sz w:val="18"/>
               </w:rPr>
               <w:t>Versioned, approved, data-driven rules with validation and a no-retroactive-change policy.</w:t>
+            </w:r>
+          </w:p>
+        </w:tc>
+      </w:tr>
+      <w:tr>
+        <w:tc>
+          <w:tcPr>
+            <w:tcW w:type="dxa" w:w="2000"/>
+          </w:tcPr>
+          <w:p>
+            <w:pPr>
+              <w:spacing w:before="0" w:after="0" w:line="269" w:lineRule="auto"/>
+            </w:pPr>
+            <w:r>
+              <w:rPr>
+                <w:rFonts w:ascii="Calibri" w:hAnsi="Calibri"/>
+                <w:color w:val="0B2545"/>
+                <w:sz w:val="18"/>
+              </w:rPr>
+              <w:t>Cross-pathway equivalency</w:t>
+            </w:r>
+          </w:p>
+        </w:tc>
+        <w:tc>
+          <w:tcPr>
+            <w:tcW w:type="dxa" w:w="3300"/>
+          </w:tcPr>
+          <w:p>
+            <w:pPr>
+              <w:spacing w:before="0" w:after="0" w:line="269" w:lineRule="auto"/>
+            </w:pPr>
+            <w:r>
+              <w:rPr>
+                <w:rFonts w:ascii="Calibri" w:hAnsi="Calibri"/>
+                <w:color w:val="0B2545"/>
+                <w:sz w:val="18"/>
+              </w:rPr>
+              <w:t>Not configured; the MVP ranks only within each pathway.</w:t>
+            </w:r>
+          </w:p>
+        </w:tc>
+        <w:tc>
+          <w:tcPr>
+            <w:tcW w:type="dxa" w:w="4060"/>
+          </w:tcPr>
+          <w:p>
+            <w:pPr>
+              <w:spacing w:before="0" w:after="0" w:line="269" w:lineRule="auto"/>
+            </w:pPr>
+            <w:r>
+              <w:rPr>
+                <w:rFonts w:ascii="Calibri" w:hAnsi="Calibri"/>
+                <w:color w:val="0B2545"/>
+                <w:sz w:val="18"/>
+              </w:rPr>
+              <w:t>Approved matrix with formulas, weights, maxima, rounding, tie rules, validation, effective cycle, approvers and immutable score snapshots.</w:t>
             </w:r>
           </w:p>
         </w:tc>
@@ -4539,7 +4749,7 @@
                 <w:color w:val="0B2545"/>
                 <w:sz w:val="18"/>
               </w:rPr>
-              <w:t>30 Node tests currently pass across domain, auth, qualification and upload-policy suites. Extend with document magic-byte fixtures, cross-organisation denial and notification status failure/retry cases.</w:t>
+              <w:t>40 Node tests currently pass across domain, auth, qualification, upload-policy and employer-export suites. Extend with document magic-byte fixtures, cross-organisation denial, equivalency-policy rejection and notification status failure/retry cases.</w:t>
             </w:r>
           </w:p>
         </w:tc>
@@ -5151,7 +5361,7 @@
           <w:rFonts w:ascii="Calibri" w:hAnsi="Calibri"/>
           <w:sz w:val="22"/>
         </w:rPr>
-        <w:t>Confirm the official closing date, post-submission edit policy, exact document labels, employer permissions, retention schedule, support owner, sender identity, Azure subscription and region, and approved qualification wording.</w:t>
+        <w:t>Confirm the official closing date, post-submission edit policy, exact document labels, employer permissions, retention schedule, support owner, sender identity, Azure subscription and region, and approved qualification wording. Keep cross-pathway ranking disabled unless GCON also approves a complete equivalency matrix.</w:t>
       </w:r>
     </w:p>
     <w:p>
@@ -5798,7 +6008,7 @@
                 <w:color w:val="0B2545"/>
                 <w:sz w:val="18"/>
               </w:rPr>
-              <w:t>Run Node domain/auth/qualification/upload tests.</w:t>
+              <w:t>Run Node domain, auth, qualification, upload-policy and employer-export tests.</w:t>
             </w:r>
           </w:p>
         </w:tc>
@@ -6023,7 +6233,7 @@
           <w:rFonts w:ascii="Calibri" w:hAnsi="Calibri"/>
           <w:sz w:val="22"/>
         </w:rPr>
-        <w:t>This document describes the state of the local repository and its local API, not a claim that production infrastructure has already been deployed. The design specification is the primary product source. The older presentation note about no tracking is interpreted as minimal learner status: receipt, correction requests and final outcome, without a detailed progress tracker. Qualification wording, document labels, retention and legal compliance remain subject to departmental approval.</w:t>
+        <w:t>This document describes the state of the local repository and its local API, not a claim that production infrastructure has already been deployed. The design specification is the primary product source. The older presentation note about no tracking is interpreted as minimal learner status: receipt, correction requests and final outcome, without a detailed progress tracker. Qualification wording, document labels, retention, legal compliance and any cross-pathway equivalency matrix remain subject to departmental approval.</w:t>
       </w:r>
     </w:p>
     <w:p>

</xml_diff>

<commit_message>
Add Sites demo registration flow
</commit_message>
<xml_diff>
--- a/GCON_2027_system_details_for_developers.docx
+++ b/GCON_2027_system_details_for_developers.docx
@@ -1166,7 +1166,7 @@
           <w:rFonts w:ascii="Calibri" w:hAnsi="Calibri"/>
           <w:sz w:val="22"/>
         </w:rPr>
-        <w:t>The current frontend demo is published privately at https://gcon-nursing-intake.alistairljohanson.chatgpt.site. The Sites deployment uses the compiled Vite assets plus dist/server/index.js, a Cloudflare-compatible worker generated by tools/build-sites-worker.mjs. The hosted worker serves the learner, admissions and employer presentation surfaces and provides a deliberately limited demo API with seeded state so the retained role pickers continue to work outside the local machine.</w:t>
+        <w:t>The current frontend demo is published at https://gcon-nursing-intake.alistairljohanson.chatgpt.site. The Sites deployment uses the compiled Vite assets plus dist/server/index.js, a Cloudflare-compatible worker generated by tools/build-sites-worker.mjs. The hosted worker serves the learner, admissions and employer presentation surfaces and provides a deliberately limited demo API with seeded state so the retained role pickers continue to work outside the local machine. Access management is labelled Sites demo registration and creates only an expiring in-memory learner session; it does not retain passwords, identifiers or personal contact details.</w:t>
       </w:r>
     </w:p>
     <w:tbl>
@@ -1223,7 +1223,7 @@
                 <w:color w:val="0B2545"/>
                 <w:sz w:val="21"/>
               </w:rPr>
-              <w:t>The Sites demo is not connected to the local encrypted API, PostgreSQL, Azure Blob Storage or local uploaded documents. Hosted state-changing actions are not a production persistence boundary. Use the local app for API, real-file upload, audit, database and document-storage acceptance. The Sites project is private to the owning ChatGPT account until its access policy is deliberately changed.</w:t>
+              <w:t>The Sites demo is not connected to the local encrypted API, PostgreSQL, Azure Blob Storage or local uploaded documents. Hosted state-changing actions are not a production persistence boundary. Use the local app for API, real-file upload, audit, database and document-storage acceptance. The public Sites demo registration is temporary and must not be used with real personal information.</w:t>
             </w:r>
           </w:p>
         </w:tc>
@@ -1726,7 +1726,7 @@
                 <w:color w:val="0B2545"/>
                 <w:sz w:val="18"/>
               </w:rPr>
-              <w:t>Private ChatGPT Sites deployment at gcon-nursing-intake.alistairljohanson.chatgpt.site. npm run build generates the static/demo worker and .openai/hosting.json stores only the Sites project ID.</w:t>
+              <w:t>ChatGPT Sites deployment at gcon-nursing-intake.alistairljohanson.chatgpt.site. npm run build generates the static/demo worker and .openai/hosting.json stores only the Sites project ID. Sites demo registration creates a temporary in-memory session and retains no password or personal contact details.</w:t>
             </w:r>
           </w:p>
         </w:tc>

</xml_diff>

<commit_message>
Persist non-qualifying qualification records
</commit_message>
<xml_diff>
--- a/GCON_2027_system_details_for_developers.docx
+++ b/GCON_2027_system_details_for_developers.docx
@@ -1166,7 +1166,7 @@
           <w:rFonts w:ascii="Calibri" w:hAnsi="Calibri"/>
           <w:sz w:val="22"/>
         </w:rPr>
-        <w:t>The current frontend demo is published at https://gcon-nursing-intake.alistairljohanson.chatgpt.site. The Sites deployment uses the compiled Vite assets plus dist/server/index.js, a Cloudflare-compatible worker generated by tools/build-sites-worker.mjs. The hosted worker serves the learner, admissions and employer presentation surfaces and provides a deliberately limited demo API with seeded state so the retained role pickers continue to work outside the local machine. Access management is labelled Sites demo registration and creates only an expiring in-memory learner session; it does not retain passwords, identifiers or personal contact details.</w:t>
+        <w:t>The current frontend demo is published at https://gcon-nursing-intake.alistairljohanson.chatgpt.site. The Sites deployment uses the compiled Vite assets plus dist/server/index.js, a Cloudflare-compatible worker generated by tools/build-sites-worker.mjs. The hosted worker serves the learner, admissions and employer presentation surfaces and provides a deliberately limited demo API with seeded state so the retained role pickers continue to work outside the local machine. Access management is labelled Sites demo registration and creates only an expiring in-memory learner session; it does not retain passwords, identifiers or personal contact details. Non-qualifying submissions retain the entered pathway values, failed criteria, status, score and contact details in the local encrypted store, while the hosted demo keeps them in memory for the current demo runtime.</w:t>
       </w:r>
     </w:p>
     <w:tbl>
@@ -1726,7 +1726,7 @@
                 <w:color w:val="0B2545"/>
                 <w:sz w:val="18"/>
               </w:rPr>
-              <w:t>ChatGPT Sites deployment at gcon-nursing-intake.alistairljohanson.chatgpt.site. npm run build generates the static/demo worker and .openai/hosting.json stores only the Sites project ID. Sites demo registration creates a temporary in-memory session and retains no password or personal contact details.</w:t>
+              <w:t>ChatGPT Sites deployment at gcon-nursing-intake.alistairljohanson.chatgpt.site. npm run build generates the static/demo worker and .openai/hosting.json stores only the Sites project ID. Sites demo registration creates a temporary in-memory session and retains no password or personal contact details; non-qualifying records are retained in hosted demo memory with the entered values and status.</w:t>
             </w:r>
           </w:p>
         </w:tc>
@@ -2581,7 +2581,7 @@
                 <w:color w:val="0B2545"/>
                 <w:sz w:val="18"/>
               </w:rPr>
-              <w:t>Data minimisation</w:t>
+              <w:t>Non-qualifying records</w:t>
             </w:r>
           </w:p>
         </w:tc>
@@ -2599,7 +2599,7 @@
                 <w:color w:val="0B2545"/>
                 <w:sz w:val="18"/>
               </w:rPr>
-              <w:t>Non-qualifying contact capture retains minimal contact details and does not retain pathway results, APS or other qualification evidence.</w:t>
+              <w:t>Non-qualifying capture retains the applicant's entered pathway values, result status, failed criteria, score and contact details so the intake team can audit what was submitted. Local records are persisted in the encrypted store; hosted demo records are in-memory only.</w:t>
             </w:r>
           </w:p>
         </w:tc>

</xml_diff>